<commit_message>
fix: confirm ECM-2022 DOI and update all [12] placeholders
DOI confirmed via CrossRef API:
  Peng, D., Fang, Z., Yu, X., Huang, Q. (2023)
  Characteristic analysis of patterned photovoltaic modules
  for building integration.
  Energy Conversion and Management 276, 116524.
  https://doi.org/10.1016/j.enconman.2022.116524

Changes:
- References_Master.md: [12] status ⚠️→✅, full biblio added,
  action item marked done
- manuscript_v1.md: reference [12] placeholder replaced with
  full Peng et al. citation; 'ECM-2022 [12]' → 'Peng et al. [12]'
  in Introduction body text and Gap 1
- manuscript_v1.docx: regenerated
</commit_message>
<xml_diff>
--- a/docs/manuscript_v1.docx
+++ b/docs/manuscript_v1.docx
@@ -248,7 +248,7 @@
           <w:i w:val="0"/>
           <w:sz w:val="24"/>
         </w:rPr>
-        <w:t>The most directly comparable prior work is that of ECM-2022 [12], who fabricated dot-matrix patterned modules using screen-printed opaque dots at three coverage levels (10%, 20%, and 30%) and characterised their electrical performance under standard test conditions. Their results confirm a near-linear relationship between colour coverage ratio (CCR) and efficiency loss, consistent with a photocurrent-dominated mechanism. The present study builds on this foundation in three respects: (i) it introduces a six-descriptor image analysis framework extending beyond CCR alone; (ii) it enforces a per-cell uniformity constraint in the pattern generation algorithm, suppressing current mismatch from 12.2% to 1.0%; and (iii) it provides a complete lab-to-product validation chain on commercially manufactured full-size modules — none of which was reported in [12].</w:t>
+        <w:t>The most directly comparable prior work is that of Peng et al. [12], who fabricated dot-matrix patterned modules using screen-printed opaque dots at three coverage levels (10%, 20%, and 30%) and characterised their electrical and thermal performance under standard test conditions. Their results confirm a near-linear relationship between colour coverage ratio (CCR) and efficiency loss, consistent with a photocurrent-dominated mechanism. The present study builds on this foundation in three respects: (i) it introduces a six-descriptor image analysis framework extending beyond CCR alone; (ii) it enforces a per-cell uniformity constraint in the pattern generation algorithm, suppressing current mismatch from 12.2% to 1.0%; and (iii) it provides a complete lab-to-product validation chain on commercially manufactured full-size modules — none of which was reported in [12].</w:t>
       </w:r>
     </w:p>
     <w:p>
@@ -325,7 +325,7 @@
           <w:i w:val="0"/>
           <w:sz w:val="24"/>
         </w:rPr>
-        <w:t xml:space="preserve"> Existing studies characterise patterned modules by CCR alone. No published framework links pattern geometry descriptors — spatial frequency, edge density, dot size variance, pattern uniformity index — to electrical performance, preventing rational design optimisation.</w:t>
+        <w:t xml:space="preserve"> Existing studies, including Peng et al. [12], characterise patterned modules by CCR alone. No published framework links pattern geometry descriptors — spatial frequency, edge density, dot size variance, pattern uniformity index — to electrical performance, preventing rational design optimisation.</w:t>
       </w:r>
     </w:p>
     <w:p>
@@ -4876,38 +4876,7 @@
           <w:i w:val="0"/>
           <w:sz w:val="24"/>
         </w:rPr>
-        <w:t xml:space="preserve">[12] [ECM-2022] Author(s) TBC, 2022. Characteristic analysis of patterned photovoltaic modules for building integration. Energy Conversion and Management [vol/pp TBC]. https://doi.org/10.1016/j.enconman.2022.XXXXX  </w:t>
-      </w:r>
-    </w:p>
-    <w:p>
-      <w:pPr>
-        <w:spacing w:before="0" w:after="120" w:lineRule="exact" w:line="480"/>
-        <w:ind w:firstLine="425"/>
-      </w:pPr>
-      <w:r>
-        <w:rPr>
-          <w:rFonts w:ascii="Times New Roman" w:hAnsi="Times New Roman"/>
-          <w:b w:val="0"/>
-          <w:i w:val="0"/>
-          <w:sz w:val="24"/>
-        </w:rPr>
-      </w:r>
-      <w:r>
-        <w:rPr>
-          <w:rFonts w:ascii="Times New Roman" w:hAnsi="Times New Roman"/>
-          <w:b w:val="0"/>
-          <w:i/>
-          <w:sz w:val="24"/>
-        </w:rPr>
-        <w:t>(DOI to be confirmed before submission — see docs/References_Master.md)</w:t>
-      </w:r>
-      <w:r>
-        <w:rPr>
-          <w:rFonts w:ascii="Times New Roman" w:hAnsi="Times New Roman"/>
-          <w:b w:val="0"/>
-          <w:i w:val="0"/>
-          <w:sz w:val="24"/>
-        </w:rPr>
+        <w:t>[12] Peng, D., Fang, Z., Yu, X., Huang, Q., 2023. Characteristic analysis of patterned photovoltaic modules for building integration. Energy Conversion and Management 276, 116524. https://doi.org/10.1016/j.enconman.2022.116524</w:t>
       </w:r>
     </w:p>
     <w:p>

</xml_diff>